<commit_message>
Branded .docx: Signal Advisory logo header, brand colors on H1/H2/H3 (signal/ink/moss); add build-docx.sh regenerate script
</commit_message>
<xml_diff>
--- a/web/public/legal/signal-advisory-loa-template.docx
+++ b/web/public/legal/signal-advisory-loa-template.docx
@@ -2,7 +2,62 @@
 <file path=word/document.xml><?xml version="1.0" encoding="utf-8"?>
 <w:document xmlns:w="http://schemas.openxmlformats.org/wordprocessingml/2006/main" xmlns:m="http://schemas.openxmlformats.org/officeDocument/2006/math" xmlns:r="http://schemas.openxmlformats.org/officeDocument/2006/relationships" xmlns:o="urn:schemas-microsoft-com:office:office" xmlns:v="urn:schemas-microsoft-com:vml" xmlns:w10="urn:schemas-microsoft-com:office:word" xmlns:a="http://schemas.openxmlformats.org/drawingml/2006/main" xmlns:pic="http://schemas.openxmlformats.org/drawingml/2006/picture" xmlns:wp="http://schemas.openxmlformats.org/drawingml/2006/wordprocessingDrawing">
   <w:body>
-    <w:bookmarkStart w:id="33" w:name="letter-of-authorization-loa"/>
+    <w:p>
+      <w:pPr>
+        <w:pStyle w:val="CaptionedFigure"/>
+      </w:pPr>
+      <w:r>
+        <w:drawing>
+          <wp:inline>
+            <wp:extent cx="4114800" cy="822960"/>
+            <wp:effectExtent b="0" l="0" r="0" t="0"/>
+            <wp:docPr descr="Signal Advisory" title="" id="21" name="Picture"/>
+            <a:graphic>
+              <a:graphicData uri="http://schemas.openxmlformats.org/drawingml/2006/picture">
+                <pic:pic>
+                  <pic:nvPicPr>
+                    <pic:cNvPr descr="/Users/brandonmurphy/Downloads/signal/legal/.doc-header-logo.png" id="22" name="Picture"/>
+                    <pic:cNvPicPr>
+                      <a:picLocks noChangeArrowheads="1" noChangeAspect="1"/>
+                    </pic:cNvPicPr>
+                  </pic:nvPicPr>
+                  <pic:blipFill>
+                    <a:blip r:embed="rId20"/>
+                    <a:stretch>
+                      <a:fillRect/>
+                    </a:stretch>
+                  </pic:blipFill>
+                  <pic:spPr bwMode="auto">
+                    <a:xfrm>
+                      <a:off x="0" y="0"/>
+                      <a:ext cx="4114800" cy="822960"/>
+                    </a:xfrm>
+                    <a:prstGeom prst="rect">
+                      <a:avLst/>
+                    </a:prstGeom>
+                    <a:noFill/>
+                    <a:ln w="9525">
+                      <a:noFill/>
+                      <a:headEnd/>
+                      <a:tailEnd/>
+                    </a:ln>
+                  </pic:spPr>
+                </pic:pic>
+              </a:graphicData>
+            </a:graphic>
+          </wp:inline>
+        </w:drawing>
+      </w:r>
+    </w:p>
+    <w:p>
+      <w:pPr>
+        <w:pStyle w:val="ImageCaption"/>
+      </w:pPr>
+      <w:r>
+        <w:t xml:space="preserve">Signal Advisory</w:t>
+      </w:r>
+    </w:p>
+    <w:bookmarkStart w:id="36" w:name="letter-of-authorization-loa"/>
     <w:p>
       <w:pPr>
         <w:pStyle w:val="Heading1"/>
@@ -11,7 +66,7 @@
         <w:t xml:space="preserve">Letter of Authorization (LOA)</w:t>
       </w:r>
     </w:p>
-    <w:bookmarkStart w:id="32" w:name="letter-of-authorization"/>
+    <w:bookmarkStart w:id="35" w:name="letter-of-authorization"/>
     <w:p>
       <w:pPr>
         <w:pStyle w:val="Heading2"/>
@@ -112,7 +167,7 @@
         </w:pict>
       </w:r>
     </w:p>
-    <w:bookmarkStart w:id="20" w:name="authorizing-customer"/>
+    <w:bookmarkStart w:id="23" w:name="authorizing-customer"/>
     <w:p>
       <w:pPr>
         <w:pStyle w:val="Heading3"/>
@@ -324,8 +379,8 @@
         </w:tc>
       </w:tr>
     </w:tbl>
-    <w:bookmarkEnd w:id="20"/>
-    <w:bookmarkStart w:id="21" w:name="authorized-agent"/>
+    <w:bookmarkEnd w:id="23"/>
+    <w:bookmarkStart w:id="24" w:name="authorized-agent"/>
     <w:p>
       <w:pPr>
         <w:pStyle w:val="Heading3"/>
@@ -521,8 +576,8 @@
         </w:tc>
       </w:tr>
     </w:tbl>
-    <w:bookmarkEnd w:id="21"/>
-    <w:bookmarkStart w:id="22" w:name="vendors-and-accounts-covered"/>
+    <w:bookmarkEnd w:id="24"/>
+    <w:bookmarkStart w:id="25" w:name="vendors-and-accounts-covered"/>
     <w:p>
       <w:pPr>
         <w:pStyle w:val="Heading3"/>
@@ -792,8 +847,8 @@
         <w:t xml:space="preserve">(Customer may add or remove vendors by written notice to Agent and to the affected vendors.)</w:t>
       </w:r>
     </w:p>
-    <w:bookmarkEnd w:id="22"/>
-    <w:bookmarkStart w:id="23" w:name="scope-of-authorization"/>
+    <w:bookmarkEnd w:id="25"/>
+    <w:bookmarkStart w:id="26" w:name="scope-of-authorization"/>
     <w:p>
       <w:pPr>
         <w:pStyle w:val="Heading3"/>
@@ -1054,8 +1109,8 @@
         <w:t xml:space="preserve">Any contract execution, service disconnection, or material change requires a separate written authorization signed by an authorized officer of the Customer.</w:t>
       </w:r>
     </w:p>
-    <w:bookmarkEnd w:id="23"/>
-    <w:bookmarkStart w:id="24" w:name="vendor-instructions"/>
+    <w:bookmarkEnd w:id="26"/>
+    <w:bookmarkStart w:id="27" w:name="vendor-instructions"/>
     <w:p>
       <w:pPr>
         <w:pStyle w:val="Heading3"/>
@@ -1120,8 +1175,8 @@
         <w:t xml:space="preserve">Promptly notify the Customer’s signatory of any action taken by the Authorized Agent that the vendor reasonably believes exceeds the scope of this authorization</w:t>
       </w:r>
     </w:p>
-    <w:bookmarkEnd w:id="24"/>
-    <w:bookmarkStart w:id="25" w:name="term"/>
+    <w:bookmarkEnd w:id="27"/>
+    <w:bookmarkStart w:id="28" w:name="term"/>
     <w:p>
       <w:pPr>
         <w:pStyle w:val="Heading3"/>
@@ -1155,8 +1210,8 @@
         <w:t xml:space="preserve">unless revoked earlier in writing by the Customer.</w:t>
       </w:r>
     </w:p>
-    <w:bookmarkEnd w:id="25"/>
-    <w:bookmarkStart w:id="26" w:name="revocation"/>
+    <w:bookmarkEnd w:id="28"/>
+    <w:bookmarkStart w:id="29" w:name="revocation"/>
     <w:p>
       <w:pPr>
         <w:pStyle w:val="Heading3"/>
@@ -1173,8 +1228,8 @@
         <w:t xml:space="preserve">The Customer may revoke this authorization, in whole or in part, at any time by written notice to (a) the Authorized Agent at the email address in Section 2 and (b) the affected vendor(s). Revocation is effective upon receipt by the vendor and does not retroactively affect any actions taken prior to revocation.</w:t>
       </w:r>
     </w:p>
-    <w:bookmarkEnd w:id="26"/>
-    <w:bookmarkStart w:id="27" w:name="indemnification-of-vendors"/>
+    <w:bookmarkEnd w:id="29"/>
+    <w:bookmarkStart w:id="30" w:name="indemnification-of-vendors"/>
     <w:p>
       <w:pPr>
         <w:pStyle w:val="Heading3"/>
@@ -1191,8 +1246,8 @@
         <w:t xml:space="preserve">The Customer agrees that any vendor acting in good-faith reliance on this Letter of Authorization, within the scope of Section 4, shall not be liable for actions taken pursuant to instructions from the Authorized Agent.</w:t>
       </w:r>
     </w:p>
-    <w:bookmarkEnd w:id="27"/>
-    <w:bookmarkStart w:id="28" w:name="confidentiality"/>
+    <w:bookmarkEnd w:id="30"/>
+    <w:bookmarkStart w:id="31" w:name="confidentiality"/>
     <w:p>
       <w:pPr>
         <w:pStyle w:val="Heading3"/>
@@ -1209,8 +1264,8 @@
         <w:t xml:space="preserve">The Authorized Agent is bound by a Master Services Agreement with the Customer that includes confidentiality obligations protecting the Customer’s account information and any information received from vendors. Vendors may rely on those obligations when sharing account information with the Authorized Agent.</w:t>
       </w:r>
     </w:p>
-    <w:bookmarkEnd w:id="28"/>
-    <w:bookmarkStart w:id="29" w:name="limitation"/>
+    <w:bookmarkEnd w:id="31"/>
+    <w:bookmarkStart w:id="32" w:name="limitation"/>
     <w:p>
       <w:pPr>
         <w:pStyle w:val="Heading3"/>
@@ -1243,8 +1298,8 @@
         <w:t xml:space="preserve">an assignment of the Customer’s contracts with any vendor and does not transfer ownership of any accounts, services, telephone numbers, or other assets. The Customer remains the contractual customer of record with each vendor.</w:t>
       </w:r>
     </w:p>
-    <w:bookmarkEnd w:id="29"/>
-    <w:bookmarkStart w:id="30" w:name="acceptance-by-vendor"/>
+    <w:bookmarkEnd w:id="32"/>
+    <w:bookmarkStart w:id="33" w:name="acceptance-by-vendor"/>
     <w:p>
       <w:pPr>
         <w:pStyle w:val="Heading3"/>
@@ -1268,8 +1323,8 @@
         </w:pict>
       </w:r>
     </w:p>
-    <w:bookmarkEnd w:id="30"/>
-    <w:bookmarkStart w:id="31" w:name="signatures"/>
+    <w:bookmarkEnd w:id="33"/>
+    <w:bookmarkStart w:id="34" w:name="signatures"/>
     <w:p>
       <w:pPr>
         <w:pStyle w:val="Heading3"/>
@@ -1475,9 +1530,9 @@
         <w:t xml:space="preserve">Many large carriers (AT&amp;T Business, Verizon Business, Lumen, Spectrum Enterprise, Comcast Business) require the customer to also complete their own LOA form before granting agent-level access. After signing this general LOA, request the carrier-specific LOA from each vendor account team and execute those as well. Keep signed copies of every LOA in the client folder for compliance and audit purposes.</w:t>
       </w:r>
     </w:p>
-    <w:bookmarkEnd w:id="31"/>
-    <w:bookmarkEnd w:id="32"/>
-    <w:bookmarkEnd w:id="33"/>
+    <w:bookmarkEnd w:id="34"/>
+    <w:bookmarkEnd w:id="35"/>
+    <w:bookmarkEnd w:id="36"/>
     <w:sectPr/>
   </w:body>
 </w:document>
@@ -1869,6 +1924,7 @@
       <w:kern w:val="28"/>
       <w:sz w:val="56"/>
       <w:szCs w:val="56"/>
+      <w:color w:val="C9462C"/>
     </w:rPr>
   </w:style>
   <w:style w:customStyle="1" w:styleId="TitleChar" w:type="character">
@@ -1995,7 +2051,7 @@
     </w:pPr>
     <w:rPr>
       <w:rFonts w:asciiTheme="majorHAnsi" w:cstheme="majorBidi" w:eastAsiaTheme="majorEastAsia" w:hAnsiTheme="majorHAnsi"/>
-      <w:color w:themeColor="accent1" w:themeShade="BF" w:val="0F4761"/>
+      <w:color w:themeColor="accent1" w:themeShade="BF" w:val="1A1F24"/>
       <w:sz w:val="40"/>
       <w:szCs w:val="40"/>
     </w:rPr>
@@ -2018,7 +2074,7 @@
     </w:pPr>
     <w:rPr>
       <w:rFonts w:asciiTheme="majorHAnsi" w:cstheme="majorBidi" w:eastAsiaTheme="majorEastAsia" w:hAnsiTheme="majorHAnsi"/>
-      <w:color w:themeColor="accent1" w:themeShade="BF" w:val="0F4761"/>
+      <w:color w:themeColor="accent1" w:themeShade="BF" w:val="C9462C"/>
       <w:sz w:val="32"/>
       <w:szCs w:val="32"/>
     </w:rPr>
@@ -2041,7 +2097,7 @@
     </w:pPr>
     <w:rPr>
       <w:rFonts w:cstheme="majorBidi" w:eastAsiaTheme="majorEastAsia"/>
-      <w:color w:themeColor="accent1" w:themeShade="BF" w:val="0F4761"/>
+      <w:color w:themeColor="accent1" w:themeShade="BF" w:val="2F4A3C"/>
       <w:sz w:val="28"/>
       <w:szCs w:val="28"/>
     </w:rPr>

</xml_diff>